<commit_message>
not sure what i did
</commit_message>
<xml_diff>
--- a/CSC-575-DSA/Assignments/Project 1/PROJECT Assignment.docx
+++ b/CSC-575-DSA/Assignments/Project 1/PROJECT Assignment.docx
@@ -1027,9 +1027,9 @@
                               <w:tblLook w:val="04A0" w:firstRow="1" w:lastRow="0" w:firstColumn="1" w:lastColumn="0" w:noHBand="0" w:noVBand="1"/>
                             </w:tblPr>
                             <w:tblGrid>
-                              <w:gridCol w:w="3429"/>
-                              <w:gridCol w:w="3430"/>
-                              <w:gridCol w:w="3430"/>
+                              <w:gridCol w:w="3434"/>
+                              <w:gridCol w:w="3435"/>
+                              <w:gridCol w:w="3435"/>
                             </w:tblGrid>
                             <w:tr>
                               <w:trPr>
@@ -1344,9 +1344,9 @@
                         <w:tblLook w:val="04A0" w:firstRow="1" w:lastRow="0" w:firstColumn="1" w:lastColumn="0" w:noHBand="0" w:noVBand="1"/>
                       </w:tblPr>
                       <w:tblGrid>
-                        <w:gridCol w:w="3429"/>
-                        <w:gridCol w:w="3430"/>
-                        <w:gridCol w:w="3430"/>
+                        <w:gridCol w:w="3434"/>
+                        <w:gridCol w:w="3435"/>
+                        <w:gridCol w:w="3435"/>
                       </w:tblGrid>
                       <w:tr>
                         <w:trPr>
@@ -3896,6 +3896,7 @@
           <w:rFonts w:ascii="Times New Roman" w:hAnsi="Times New Roman" w:cs="Times New Roman"/>
           <w:b/>
           <w:bCs/>
+          <w:noProof/>
           <w:sz w:val="24"/>
           <w:szCs w:val="24"/>
         </w:rPr>
@@ -5547,20 +5548,37 @@
           <w:sz w:val="24"/>
           <w:szCs w:val="24"/>
         </w:rPr>
-        <w:t xml:space="preserve"> a linked list program would like to keep track of are the Head and the Tail Nodes. Because a linked list is stored randomly in memory, unlink an array which is stored serially, there is no inherent index property to the structure. Therefore, when looping through or interrogating the linked list, you cannot use the index values or length of the structure as you would when using an array, instead you create pointers that move along the linked list. These pointers can utilize the “Head” to know which Node begins the linked list, and the “Tail” to know which Node ends the linked list.</w:t>
-      </w:r>
-    </w:p>
-    <w:p>
-      <w:pPr>
-        <w:rPr>
-          <w:rFonts w:ascii="Times New Roman" w:hAnsi="Times New Roman" w:cs="Times New Roman"/>
-          <w:sz w:val="24"/>
-          <w:szCs w:val="24"/>
-        </w:rPr>
-      </w:pPr>
-      <w:r>
-        <w:rPr>
-          <w:rFonts w:ascii="Times New Roman" w:hAnsi="Times New Roman" w:cs="Times New Roman"/>
+        <w:t xml:space="preserve"> a linked list program would like to keep track of are the Head and the Tail Nodes. </w:t>
+      </w:r>
+      <w:r>
+        <w:rPr>
+          <w:rFonts w:ascii="Times New Roman" w:hAnsi="Times New Roman" w:cs="Times New Roman"/>
+          <w:sz w:val="24"/>
+          <w:szCs w:val="24"/>
+        </w:rPr>
+        <w:t>Since</w:t>
+      </w:r>
+      <w:r>
+        <w:rPr>
+          <w:rFonts w:ascii="Times New Roman" w:hAnsi="Times New Roman" w:cs="Times New Roman"/>
+          <w:sz w:val="24"/>
+          <w:szCs w:val="24"/>
+        </w:rPr>
+        <w:t xml:space="preserve"> a linked list is stored randomly in memory, unlink an array which is stored serially, there is no inherent index property to the structure. Therefore, when looping through or interrogating the linked list, you cannot use the index values or length of the structure as you would when using an array, instead you create pointers that move along the linked list. These pointers can utilize the “Head” to know which Node begins the linked list, and the “Tail” to know which Node ends the linked list.</w:t>
+      </w:r>
+    </w:p>
+    <w:p>
+      <w:pPr>
+        <w:rPr>
+          <w:rFonts w:ascii="Times New Roman" w:hAnsi="Times New Roman" w:cs="Times New Roman"/>
+          <w:sz w:val="24"/>
+          <w:szCs w:val="24"/>
+        </w:rPr>
+      </w:pPr>
+      <w:r>
+        <w:rPr>
+          <w:rFonts w:ascii="Times New Roman" w:hAnsi="Times New Roman" w:cs="Times New Roman"/>
+          <w:noProof/>
           <w:sz w:val="24"/>
           <w:szCs w:val="24"/>
         </w:rPr>
@@ -8101,7 +8119,7 @@
             </wp:anchor>
           </w:drawing>
         </mc:Choice>
-        <mc:Fallback xmlns:w16sdtfl="http://schemas.microsoft.com/office/word/2024/wordml/sdtformatlock" xmlns:w16du="http://schemas.microsoft.com/office/word/2023/wordml/word16du">
+        <mc:Fallback xmlns:w16du="http://schemas.microsoft.com/office/word/2023/wordml/word16du" xmlns:w16sdtfl="http://schemas.microsoft.com/office/word/2024/wordml/sdtformatlock">
           <w:pict>
             <v:line w14:anchorId="6E23BF16" id="Straight Connector 6" o:spid="_x0000_s1026" style="position:absolute;z-index:251659264;visibility:visible;mso-wrap-style:square;mso-width-percent:0;mso-height-percent:0;mso-wrap-distance-left:9pt;mso-wrap-distance-top:-3e-5mm;mso-wrap-distance-right:9pt;mso-wrap-distance-bottom:-3e-5mm;mso-position-horizontal:absolute;mso-position-horizontal-relative:text;mso-position-vertical:absolute;mso-position-vertical-relative:text;mso-width-percent:0;mso-height-percent:0;mso-width-relative:page;mso-height-relative:page" from="-68.95pt,-666.45pt" to="489.05pt,-666.45pt" o:gfxdata="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" strokecolor="#4f81bd" strokeweight="2pt">
               <v:shadow on="t" opacity="24903f" origin=",.5" offset="0,.55556mm"/>
@@ -12356,6 +12374,7 @@
   <w:style w:type="character" w:default="1" w:styleId="DefaultParagraphFont">
     <w:name w:val="Default Paragraph Font"/>
     <w:uiPriority w:val="1"/>
+    <w:semiHidden/>
     <w:unhideWhenUsed/>
   </w:style>
   <w:style w:type="table" w:default="1" w:styleId="TableNormal">
@@ -13586,16 +13605,16 @@
 </file>
 
 <file path=customXml/item2.xml><?xml version="1.0" encoding="utf-8"?>
-<b:Sources xmlns:b="http://schemas.openxmlformats.org/officeDocument/2006/bibliography" SelectedStyle="\APA.XSL" StyleName="APA"/>
-</file>
-
-<file path=customXml/item3.xml><?xml version="1.0" encoding="utf-8"?>
 <?mso-contentType ?>
 <FormTemplates xmlns="http://schemas.microsoft.com/sharepoint/v3/contenttype/forms">
   <Display>DocumentLibraryForm</Display>
   <Edit>AssetEditForm</Edit>
   <New>DocumentLibraryForm</New>
 </FormTemplates>
+</file>
+
+<file path=customXml/item3.xml><?xml version="1.0" encoding="utf-8"?>
+<b:Sources xmlns:b="http://schemas.openxmlformats.org/officeDocument/2006/bibliography" SelectedStyle="\APA.XSL" StyleName="APA"/>
 </file>
 
 <file path=customXml/itemProps1.xml><?xml version="1.0" encoding="utf-8"?>
@@ -13607,17 +13626,17 @@
 </file>
 
 <file path=customXml/itemProps2.xml><?xml version="1.0" encoding="utf-8"?>
+<ds:datastoreItem xmlns:ds="http://schemas.openxmlformats.org/officeDocument/2006/customXml" ds:itemID="{E34C63B7-A026-4A37-9535-4FBB4C03A11D}">
+  <ds:schemaRefs>
+    <ds:schemaRef ds:uri="http://schemas.microsoft.com/sharepoint/v3/contenttype/forms"/>
+  </ds:schemaRefs>
+</ds:datastoreItem>
+</file>
+
+<file path=customXml/itemProps3.xml><?xml version="1.0" encoding="utf-8"?>
 <ds:datastoreItem xmlns:ds="http://schemas.openxmlformats.org/officeDocument/2006/customXml" ds:itemID="{546CFA27-0520-4C6C-A024-61297FAC9E0C}">
   <ds:schemaRefs>
     <ds:schemaRef ds:uri="http://schemas.openxmlformats.org/officeDocument/2006/bibliography"/>
   </ds:schemaRefs>
 </ds:datastoreItem>
-</file>
-
-<file path=customXml/itemProps3.xml><?xml version="1.0" encoding="utf-8"?>
-<ds:datastoreItem xmlns:ds="http://schemas.openxmlformats.org/officeDocument/2006/customXml" ds:itemID="{E34C63B7-A026-4A37-9535-4FBB4C03A11D}">
-  <ds:schemaRefs>
-    <ds:schemaRef ds:uri="http://schemas.microsoft.com/sharepoint/v3/contenttype/forms"/>
-  </ds:schemaRefs>
-</ds:datastoreItem>
 </file>
</xml_diff>